<commit_message>
Sprint 2: T-49 publicada en la prueba interna de Google Play
Decision 10.45. Version 1 (1.0.0) publicada el 3-oct; T-49 sigue en curso hasta instalarla en el Honor desde Play. Tablero v32, documento y presentacion del Incremento 2 al 3-oct.
</commit_message>
<xml_diff>
--- a/docs/BayStream_Incremento2_Seguridad_Calidad.docx
+++ b/docs/BayStream_Incremento2_Seguridad_Calidad.docx
@@ -281,7 +281,7 @@
         <w:jc w:val="both"/>
       </w:pPr>
       <w:r>
-        <w:t xml:space="preserve">El estado que se reporta corresponde al 2 de octubre de 2026. A esa fecha quedaba abierta una sola tarea comprometida: la publicación del paquete Android en la prueba interna de Google Play, cuya duración depende de la verificación de identidad que realiza Google y no del equipo.</w:t>
+        <w:t xml:space="preserve">El estado que se reporta corresponde al 3 de octubre de 2026. A esa fecha quedaba abierta una sola tarea comprometida: la última comprobación del despliegue en Android. La aplicación ya está publicada en la prueba interna de Google Play; falta instalarla en el teléfono desde la tienda, que es el criterio de terminado de esa tarea.</w:t>
       </w:r>
     </w:p>
     <w:p>
@@ -807,7 +807,7 @@
         <w:jc w:val="both"/>
       </w:pPr>
       <w:r>
-        <w:t xml:space="preserve">Una tarea comprometida sigue abierta a la fecha de corte. El paquete Android está firmado y verificado, pero su publicación en la prueba interna espera la verificación de identidad de la cuenta de desarrollador. De esa tarea se reporta su primera parte.</w:t>
+        <w:t xml:space="preserve">Una tarea comprometida sigue abierta a la fecha de corte. El paquete Android está publicado en la prueba interna de Google Play, pero su criterio de terminado —instalarlo en el teléfono desde la tienda— aún no se había comprobado.</w:t>
       </w:r>
     </w:p>
     <w:p>
@@ -1378,7 +1378,7 @@
         <w:jc w:val="both"/>
       </w:pPr>
       <w:r>
-        <w:t xml:space="preserve">El documento rector del sprint es un brief de implementación versionado en la raíz del repositorio. Contiene las restricciones, una ficha por tarea con su criterio de terminado, la Definición de Terminado y un registro de decisiones. Al 2 de octubre de 2026 ese registro reunía 44 decisiones fechadas, y cada una que corrige a otra lo declara.</w:t>
+        <w:t xml:space="preserve">El documento rector del sprint es un brief de implementación versionado en la raíz del repositorio. Contiene las restricciones, una ficha por tarea con su criterio de terminado, la Definición de Terminado y un registro de decisiones. Al 3 de octubre de 2026 ese registro reunía 44 decisiones fechadas, y cada una que corrige a otra lo declara.</w:t>
       </w:r>
     </w:p>
     <w:p>
@@ -2417,7 +2417,7 @@
                 <w:sz w:val="20"/>
                 <w:szCs w:val="20"/>
               </w:rPr>
-              <w:t xml:space="preserve">Proyecto de producción, cliente Web publicado en una dirección pública y paquete Android firmado. Falta su publicación en la prueba interna.</w:t>
+              <w:t xml:space="preserve">Proyecto de producción, cliente Web publicado y aplicación Android publicada en la prueba interna de Google Play. Falta instalarla en el teléfono desde la tienda.</w:t>
             </w:r>
           </w:p>
         </w:tc>
@@ -3467,7 +3467,7 @@
                 <w:sz w:val="20"/>
                 <w:szCs w:val="20"/>
               </w:rPr>
-              <w:t xml:space="preserve">T‑49: firma terminada; la publicación espera a Google</w:t>
+              <w:t xml:space="preserve">T‑49: publicada en la prueba interna; falta instalarla desde Play</w:t>
             </w:r>
           </w:p>
         </w:tc>
@@ -4758,7 +4758,7 @@
         <w:jc w:val="both"/>
       </w:pPr>
       <w:r>
-        <w:t xml:space="preserve">Cada tarea comprometida termina en una confirmación verificable del repositorio. Esa correspondencia es lo que permite auditar el incremento: no se afirma que una funcionalidad exista, se señala dónde está su implementación. Entre el 19 de septiembre y el 2 de octubre de 2026 el repositorio registra 81 confirmaciones: 46 de tareas, informes y evidencia, y 35 de seguimiento del sprint, entre el registro de decisiones y el tablero. La Tabla 83 relaciona las tareas comprometidas con su confirmación principal.</w:t>
+        <w:t xml:space="preserve">Cada tarea comprometida termina en una confirmación verificable del repositorio. Esa correspondencia es lo que permite auditar el incremento: no se afirma que una funcionalidad exista, se señala dónde está su implementación. Entre el 19 de septiembre y el 3 de octubre de 2026 el repositorio registra 82 confirmaciones: 47 de tareas, informes, evidencia y entregables, y 35 de seguimiento del sprint, entre el registro de decisiones y el tablero. La Tabla 83 relaciona las tareas comprometidas con su confirmación principal.</w:t>
       </w:r>
     </w:p>
     <w:p>
@@ -6469,7 +6469,7 @@
         <w:t xml:space="preserve">Fuente: </w:t>
       </w:r>
       <w:r>
-        <w:t xml:space="preserve">Historial del repositorio del proyecto, verificado el 2 de octubre de 2026.</w:t>
+        <w:t xml:space="preserve">Historial del repositorio del proyecto, verificado el 3 de octubre de 2026.</w:t>
       </w:r>
     </w:p>
     <w:p>
@@ -9882,7 +9882,7 @@
                 <w:sz w:val="20"/>
                 <w:szCs w:val="20"/>
               </w:rPr>
-              <w:t xml:space="preserve">Paquete .aab firmado con la clave de subida y verificado. Su publicación en la prueba interna espera la verificación de identidad de Google.</w:t>
+              <w:t xml:space="preserve">Paquete .aab firmado con la clave de subida y publicado el 3 de octubre en la prueba interna de Google Play, versión 1 (1.0.0), sin errores ni advertencias en la revisión de la consola. Falta instalarlo en el teléfono desde la tienda.</w:t>
             </w:r>
           </w:p>
         </w:tc>
@@ -10068,7 +10068,7 @@
         <w:t xml:space="preserve">testers</w:t>
       </w:r>
       <w:r>
-        <w:t xml:space="preserve"> durante 14 días continuos antes de solicitar el acceso a producción (Google, s.f.-a), plazo que no cabía antes del 17 de octubre. El criterio vigente es instalar la aplicación en el teléfono desde la prueba interna, que no tiene ese requisito y puede iniciarse antes de completar la configuración de la aplicación (Google, s.f.-b).</w:t>
+        <w:t xml:space="preserve"> durante 14 días continuos antes de solicitar el acceso a producción (Google, s.f.-a), plazo que no cabía antes del 17 de octubre. El criterio vigente es instalar la aplicación en el teléfono desde la prueba interna, que no tiene ese requisito y puede iniciarse antes de completar la configuración de la aplicación (Google, s.f.-b). La versión 1 (1.0.0) se publicó en ese canal el 3 de octubre, un día después de que Google verificara la identidad del autor.</w:t>
       </w:r>
     </w:p>
     <w:p>
@@ -11116,7 +11116,7 @@
         <w:t xml:space="preserve">Los trámites externos empezaron tarde.</w:t>
       </w:r>
       <w:r>
-        <w:t xml:space="preserve"> Se planificaron desde el primer día y se iniciaron el 1 de octubre, el decimotercer día del sprint. Por eso la verificación de identidad de Google es hoy la única tarea comprometida abierta.</w:t>
+        <w:t xml:space="preserve"> Se planificaron desde el primer día y se iniciaron el 1 de octubre, el decimotercer día del sprint. Por eso la publicación en Google Play llegó al final: la identidad se verificó el 2 de octubre y la versión se publicó el 3.</w:t>
       </w:r>
     </w:p>
     <w:p>
@@ -11233,7 +11233,7 @@
         <w:jc w:val="both"/>
       </w:pPr>
       <w:r>
-        <w:t xml:space="preserve">Abrir la prueba cerrada de Google Play en cuanto la prueba interna esté publicada, con los 12 </w:t>
+        <w:t xml:space="preserve">Abrir la prueba cerrada de Google Play, ahora que la prueba interna está publicada, con los 12 </w:t>
       </w:r>
       <w:r>
         <w:rPr>
@@ -11375,7 +11375,7 @@
         <w:jc w:val="both"/>
       </w:pPr>
       <w:r>
-        <w:t xml:space="preserve">El Sprint 2 cumplió su objetivo. La aplicación dejó de inferir el buque y pasó a conocerlo: la geometría se declara una vez, se recuerda entre escalas y sostiene un motor de validación de cuatro reglas con tres estados. De las 26 tareas comprometidas se terminaron 25, con 33.0 de las 35.0 horas; la restante, la publicación en Google Play, tiene terminada su parte técnica y espera la verificación de identidad que realiza Google.</w:t>
+        <w:t xml:space="preserve">El Sprint 2 cumplió su objetivo. La aplicación dejó de inferir el buque y pasó a conocerlo: la geometría se declara una vez, se recuerda entre escalas y sostiene un motor de validación de cuatro reglas con tres estados. De las 26 tareas comprometidas se terminaron 25, con 33.0 de las 35.0 horas; la restante ya está publicada en la prueba interna de Google Play, y solo falta comprobar su instalación desde la tienda.</w:t>
       </w:r>
     </w:p>
     <w:p>

</xml_diff>

<commit_message>
Sprint 2: prueba de campo del MAGELLAN STAR, H3 corregida y decisiones de RNF
Decisiones 10.46 y 10.47: cuatro defectos encontrados con los planos reales de llegada y de carga pasan al Sprint 3 (pesos solo VGM, peso por pila sin VGM, 'de paso' invertido en llegada, celdas reservadas sin numero descartadas). Parrafo de H3 corregido en el documento y las diapositivas 11 a 13. docs/T63-DECISIONES-RNF.md fija los criterios de T-63 y el orden de medicion.
</commit_message>
<xml_diff>
--- a/docs/BayStream_Incremento2_Seguridad_Calidad.docx
+++ b/docs/BayStream_Incremento2_Seguridad_Calidad.docx
@@ -11256,6 +11256,20 @@
         <w:jc w:val="both"/>
       </w:pPr>
       <w:r>
+        <w:t xml:space="preserve">Convertir en requerimiento el módulo de muelle que describen los casos de uso CU04 y CU10 (Martínez Aldana, 2026b). Ningún requerimiento funcional lo recogía, y por eso nunca entró al Product Backlog.</w:t>
+      </w:r>
+    </w:p>
+    <w:p>
+      <w:pPr>
+        <w:numPr>
+          <w:ilvl w:val="0"/>
+          <w:numId w:val="50"/>
+        </w:numPr>
+        <w:spacing w:after="880"/>
+        <w:ind w:left="1559" w:hanging="709"/>
+        <w:jc w:val="both"/>
+      </w:pPr>
+      <w:r>
         <w:t xml:space="preserve">Completar lo que exige Google Play y no podía cambiarse con el producto congelado: el enlace a la política de privacidad dentro de la aplicación, el ícono propio y la decisión sobre el respaldo automático.</w:t>
       </w:r>
     </w:p>
@@ -11289,7 +11303,7 @@
         <w:jc w:val="both"/>
       </w:pPr>
       <w:r>
-        <w:t xml:space="preserve">La hipótesis H3 sostiene que la validación preventiva a pie de muelle reduce los errores de posición de contenedores, y su indicador es el porcentaje de contenedores mal posicionados que se detectan antes del movimiento de la grúa (Martínez Aldana, 2026a). El Sprint 2 construye el instrumento de esa hipótesis, pero no la mide. El motor existe, se validó sobre el corpus real —cada alerta tiene un origen explicable y las de mayor severidad las juzgó válidas el autor— y sus casos positivos están cubiertos por pruebas automáticas con datos controlados. El indicador de H3, en cambio, exige escenarios simulados de posicionamiento incorrecto con registro de detecciones correctas e incorrectas, y esa prueba no se ha ejecutado. El tercer estado de las validaciones afectará su diseño: una regla que no puede decidir no detecta ni deja de detectar, y el protocolo tendrá que establecer cómo se cuenta.</w:t>
+        <w:t xml:space="preserve">La hipótesis H3 sostiene que la validación preventiva a pie de muelle reduce los errores de posición de contenedores, y su indicador es el porcentaje de contenedores mal posicionados que se detectan antes del movimiento de la grúa (Martínez Aldana, 2026a). El cuarto objetivo específico de la investigación precisa dónde ocurre esa validación: en un módulo de muelle con listado de secuencia digital, que compara la posición física del contenedor con la planificada antes de autorizar el movimiento, como describen los casos de uso CU04 y CU10 (Martínez Aldana, 2026a, 2026b). Ese módulo no existe todavía. Al pasar de los casos de uso a los requerimientos funcionales ninguno lo recogió, y por eso no entró al Product Backlog; el vacío se detectó al planificar el sprint siguiente. Lo que el Sprint 2 construye es una pieza que el módulo aprovechará: las reglas de estiba de RF‑027, que evalúan el plano completo, se validaron sobre el corpus real y tienen sus casos positivos cubiertos por pruebas automáticas. H3, por tanto, todavía no tiene instrumento ni indicador medido. Cuando el módulo exista, el protocolo de medición tendrá que establecer cómo se cuenta una regla que no puede decidir, porque el tercer estado de las validaciones no detecta ni deja de detectar.</w:t>
       </w:r>
     </w:p>
     <w:p>

</xml_diff>

<commit_message>
Sprint 2 cerrado: T-49 terminada, 26 de 26 tareas y 35.0 h
Decision 10.49: la app instalada desde Google Play arranca sin red y abre un plan real. Entrega del 17-oct con corte al 6-oct: documento con el apartado III.G de la prueba de campo (Tabla 89, Tablas 77-90), presentacion de 14 diapositivas y tablero 26/26. RNF ajustados a pantallas de 1920x1080 y a Windows 11 con Windows 10 en uso. Caso MAGELLAN STAR con las respuestas de Carlos y el IMDG 42-24 recibido, fuera del repositorio.
</commit_message>
<xml_diff>
--- a/docs/BayStream_Incremento2_Seguridad_Calidad.docx
+++ b/docs/BayStream_Incremento2_Seguridad_Calidad.docx
@@ -281,7 +281,7 @@
         <w:jc w:val="both"/>
       </w:pPr>
       <w:r>
-        <w:t xml:space="preserve">El estado que se reporta corresponde al 3 de octubre de 2026. A esa fecha quedaba abierta una sola tarea comprometida: la última comprobación del despliegue en Android. La aplicación ya está publicada en la prueba interna de Google Play; falta instalarla en el teléfono desde la tienda, que es el criterio de terminado de esa tarea.</w:t>
+        <w:t xml:space="preserve">El estado que se reporta corresponde al 6 de octubre de 2026. A esa fecha estaban terminadas las 26 tareas comprometidas. La última, el despliegue en Android, se cerró al comprobar que la aplicación se instala en el teléfono desde la prueba interna de Google Play y arranca sin conexión. El reporte incluye además la primera prueba de campo del producto con los archivos de una operación real.</w:t>
       </w:r>
     </w:p>
     <w:p>
@@ -807,7 +807,7 @@
         <w:jc w:val="both"/>
       </w:pPr>
       <w:r>
-        <w:t xml:space="preserve">Una tarea comprometida sigue abierta a la fecha de corte. El paquete Android está publicado en la prueba interna de Google Play, pero su criterio de terminado —instalarlo en el teléfono desde la tienda— aún no se había comprobado.</w:t>
+        <w:t xml:space="preserve">La prueba de campo con los archivos de una operación real (apartado III.G) abarca una sola escala de un buque y la realizó el propio autor. Los defectos que encontró se corrigen en el sprint siguiente, de modo que el incremento que aquí se evalúa todavía los contiene.</w:t>
       </w:r>
     </w:p>
     <w:p>
@@ -1378,7 +1378,7 @@
         <w:jc w:val="both"/>
       </w:pPr>
       <w:r>
-        <w:t xml:space="preserve">El documento rector del sprint es un brief de implementación versionado en la raíz del repositorio. Contiene las restricciones, una ficha por tarea con su criterio de terminado, la Definición de Terminado y un registro de decisiones. Al 3 de octubre de 2026 ese registro reunía 44 decisiones fechadas, y cada una que corrige a otra lo declara.</w:t>
+        <w:t xml:space="preserve">El documento rector del sprint es un brief de implementación versionado en la raíz del repositorio. Contiene las restricciones, una ficha por tarea con su criterio de terminado, la Definición de Terminado y un registro de decisiones. Al 6 de octubre de 2026 ese registro reunía 44 decisiones fechadas, y cada una que corrige a otra lo declara.</w:t>
       </w:r>
     </w:p>
     <w:p>
@@ -1523,7 +1523,7 @@
         <w:jc w:val="both"/>
       </w:pPr>
       <w:r>
-        <w:t xml:space="preserve">De los seis elementos comprometidos, cinco se entregaron completos y uno, TC‑04, quedó con su última tarea en curso. La Tabla 79 los presenta por el valor que aportan al planificador de estiba y no por su implementación.</w:t>
+        <w:t xml:space="preserve">Los seis elementos comprometidos se entregaron completos. La Tabla 79 los presenta por el valor que aportan al planificador de estiba y no por su implementación.</w:t>
       </w:r>
     </w:p>
     <w:p>
@@ -2398,7 +2398,7 @@
                 <w:sz w:val="20"/>
                 <w:szCs w:val="20"/>
               </w:rPr>
-              <w:t xml:space="preserve">En curso</w:t>
+              <w:t xml:space="preserve">Terminado</w:t>
             </w:r>
           </w:p>
         </w:tc>
@@ -2417,7 +2417,7 @@
                 <w:sz w:val="20"/>
                 <w:szCs w:val="20"/>
               </w:rPr>
-              <w:t xml:space="preserve">Proyecto de producción, cliente Web publicado y aplicación Android publicada en la prueba interna de Google Play. Falta instalarla en el teléfono desde la tienda.</w:t>
+              <w:t xml:space="preserve">Proyecto de producción, cliente Web publicado y aplicación Android en la prueba interna de Google Play, instalada en el teléfono desde la tienda.</w:t>
             </w:r>
           </w:p>
         </w:tc>
@@ -2532,7 +2532,7 @@
                 <w:sz w:val="20"/>
                 <w:szCs w:val="20"/>
               </w:rPr>
-              <w:t xml:space="preserve">25 de 26 tareas terminadas · 33.0 h</w:t>
+              <w:t xml:space="preserve">26 de 26 tareas terminadas · 35.0 h</w:t>
             </w:r>
           </w:p>
         </w:tc>
@@ -3091,7 +3091,7 @@
         <w:jc w:val="both"/>
       </w:pPr>
       <w:r>
-        <w:t xml:space="preserve">La Tabla 81 contrasta el compromiso con lo ejecutado. Ninguna tarea comprometida quedó sin empezar.</w:t>
+        <w:t xml:space="preserve">La Tabla 81 contrasta el compromiso con lo ejecutado. Todas las tareas comprometidas se terminaron.</w:t>
       </w:r>
     </w:p>
     <w:p>
@@ -3347,7 +3347,7 @@
                 <w:sz w:val="20"/>
                 <w:szCs w:val="20"/>
               </w:rPr>
-              <w:t xml:space="preserve">25</w:t>
+              <w:t xml:space="preserve">26</w:t>
             </w:r>
           </w:p>
         </w:tc>
@@ -3366,7 +3366,7 @@
                 <w:sz w:val="20"/>
                 <w:szCs w:val="20"/>
               </w:rPr>
-              <w:t xml:space="preserve">33.0</w:t>
+              <w:t xml:space="preserve">35.0</w:t>
             </w:r>
           </w:p>
         </w:tc>
@@ -3385,89 +3385,7 @@
                 <w:sz w:val="20"/>
                 <w:szCs w:val="20"/>
               </w:rPr>
-              <w:t xml:space="preserve">Cinco elementos completos</w:t>
-            </w:r>
-          </w:p>
-        </w:tc>
-      </w:tr>
-      <w:tr>
-        <w:trPr>
-          <w:cantSplit/>
-        </w:trPr>
-        <w:tc>
-          <w:tcPr>
-            <w:tcW w:w="2401" w:type="dxa"/>
-          </w:tcPr>
-          <w:p>
-            <w:pPr>
-              <w:spacing w:before="40" w:after="40" w:line="240" w:lineRule="auto"/>
-              <w:ind w:left="0" w:firstLine="0"/>
-              <w:jc w:val="left"/>
-            </w:pPr>
-            <w:r>
-              <w:rPr>
-                <w:b/>
-                <w:sz w:val="20"/>
-                <w:szCs w:val="20"/>
-              </w:rPr>
-              <w:t xml:space="preserve">En curso</w:t>
-            </w:r>
-          </w:p>
-        </w:tc>
-        <w:tc>
-          <w:tcPr>
-            <w:tcW w:w="906" w:type="dxa"/>
-          </w:tcPr>
-          <w:p>
-            <w:pPr>
-              <w:spacing w:before="40" w:after="40" w:line="240" w:lineRule="auto"/>
-              <w:ind w:left="0" w:firstLine="0"/>
-              <w:jc w:val="center"/>
-            </w:pPr>
-            <w:r>
-              <w:rPr>
-                <w:sz w:val="20"/>
-                <w:szCs w:val="20"/>
-              </w:rPr>
-              <w:t xml:space="preserve">1</w:t>
-            </w:r>
-          </w:p>
-        </w:tc>
-        <w:tc>
-          <w:tcPr>
-            <w:tcW w:w="874" w:type="dxa"/>
-          </w:tcPr>
-          <w:p>
-            <w:pPr>
-              <w:spacing w:before="40" w:after="40" w:line="240" w:lineRule="auto"/>
-              <w:ind w:left="0" w:firstLine="0"/>
-              <w:jc w:val="center"/>
-            </w:pPr>
-            <w:r>
-              <w:rPr>
-                <w:sz w:val="20"/>
-                <w:szCs w:val="20"/>
-              </w:rPr>
-              <w:t xml:space="preserve">2.0</w:t>
-            </w:r>
-          </w:p>
-        </w:tc>
-        <w:tc>
-          <w:tcPr>
-            <w:tcW w:w="3700" w:type="dxa"/>
-          </w:tcPr>
-          <w:p>
-            <w:pPr>
-              <w:spacing w:before="40" w:after="40" w:line="240" w:lineRule="auto"/>
-              <w:ind w:left="0" w:firstLine="0"/>
-              <w:jc w:val="left"/>
-            </w:pPr>
-            <w:r>
-              <w:rPr>
-                <w:sz w:val="20"/>
-                <w:szCs w:val="20"/>
-              </w:rPr>
-              <w:t xml:space="preserve">T‑49: publicada en la prueba interna; falta instalarla desde Play</w:t>
+              <w:t xml:space="preserve">Seis elementos completos</w:t>
             </w:r>
           </w:p>
         </w:tc>
@@ -6469,7 +6387,7 @@
         <w:t xml:space="preserve">Fuente: </w:t>
       </w:r>
       <w:r>
-        <w:t xml:space="preserve">Historial del repositorio del proyecto, verificado el 3 de octubre de 2026.</w:t>
+        <w:t xml:space="preserve">Historial del repositorio del proyecto, verificado el 6 de octubre de 2026.</w:t>
       </w:r>
     </w:p>
     <w:p>
@@ -9882,7 +9800,7 @@
                 <w:sz w:val="20"/>
                 <w:szCs w:val="20"/>
               </w:rPr>
-              <w:t xml:space="preserve">Paquete .aab firmado con la clave de subida y publicado el 3 de octubre en la prueba interna de Google Play, versión 1 (1.0.0), sin errores ni advertencias en la revisión de la consola. Falta instalarlo en el teléfono desde la tienda.</w:t>
+              <w:t xml:space="preserve">Paquete .aab firmado con la clave de subida y publicado el 3 de octubre en la prueba interna de Google Play, versión 1 (1.0.0), sin errores ni advertencias en la revisión de la consola. Instalado en el teléfono desde la tienda; arranca sin conexión.</w:t>
             </w:r>
           </w:p>
         </w:tc>
@@ -10068,7 +9986,7 @@
         <w:t xml:space="preserve">testers</w:t>
       </w:r>
       <w:r>
-        <w:t xml:space="preserve"> durante 14 días continuos antes de solicitar el acceso a producción (Google, s.f.-a), plazo que no cabía antes del 17 de octubre. El criterio vigente es instalar la aplicación en el teléfono desde la prueba interna, que no tiene ese requisito y puede iniciarse antes de completar la configuración de la aplicación (Google, s.f.-b). La versión 1 (1.0.0) se publicó en ese canal el 3 de octubre, un día después de que Google verificara la identidad del autor.</w:t>
+        <w:t xml:space="preserve"> durante 14 días continuos antes de solicitar el acceso a producción (Google, s.f.-a), plazo que no cabía antes del 17 de octubre. El criterio vigente es instalar la aplicación en el teléfono desde la prueba interna, que no tiene ese requisito y puede iniciarse antes de completar la configuración de la aplicación (Google, s.f.-b). La versión 1 (1.0.0) se publicó en ese canal el 3 de octubre, un día después de que Google verificara la identidad del autor. El 5 de octubre se comprobó la instalación en el teléfono desde la tienda, con lo que T‑49 cumplió su criterio. El 6 se comprobó además que la versión que entrega la tienda, a la que Google añade una verificación de licencia, arranca sin conexión y abre un plan de carga real.</w:t>
       </w:r>
     </w:p>
     <w:p>
@@ -10079,6 +9997,427 @@
       </w:pPr>
       <w:r>
         <w:t xml:space="preserve">Una limitación del cliente Web quedó declarada por decisión del autor: sin conexión ni caché, la página publicada no arranca, porque descarga el motor de dibujo y la fuente tipográfica de servidores de Google. Windows y Android sí arrancan sin red, y el caso de uso sin señal en el muelle lo cubre Android. Servir esos recursos desde el propio sitio queda para el sprint siguiente.</w:t>
+      </w:r>
+    </w:p>
+    <w:p>
+      <w:pPr>
+        <w:pStyle w:val="Heading2"/>
+        <w:spacing w:before="0" w:after="760"/>
+      </w:pPr>
+      <w:r>
+        <w:t xml:space="preserve">Prueba de campo con una operación real</w:t>
+      </w:r>
+    </w:p>
+    <w:p>
+      <w:pPr>
+        <w:spacing w:after="880"/>
+        <w:ind w:left="850" w:firstLine="357"/>
+        <w:jc w:val="both"/>
+      </w:pPr>
+      <w:r>
+        <w:t xml:space="preserve">Entre el 5 y el 6 de octubre el autor usó la aplicación publicada con los archivos de una escala real de un buque portacontenedores en Puerto Santo Tomás de Castilla. Abrió el BAPLIE de llegada, de 398 contenedores, en la Web desde un iPhone, y el plan de carga del planificador de la línea, de 460 posiciones, en el teléfono Android instalado desde la tienda. Fue la primera vez que el producto se usó con los archivos de una operación y no con el corpus. La Tabla 89 resume los cuatro defectos que encontró, confirmados sobre los archivos y sobre el código.</w:t>
+      </w:r>
+    </w:p>
+    <w:p>
+      <w:pPr>
+        <w:keepNext/>
+        <w:spacing w:after="0"/>
+        <w:ind w:left="850" w:firstLine="0"/>
+        <w:jc w:val="left"/>
+      </w:pPr>
+      <w:r>
+        <w:rPr>
+          <w:b/>
+        </w:rPr>
+        <w:t>Tabla 89.</w:t>
+      </w:r>
+    </w:p>
+    <w:p>
+      <w:pPr>
+        <w:keepNext/>
+        <w:spacing w:after="0" w:line="480" w:lineRule="auto"/>
+        <w:ind w:left="850" w:firstLine="0"/>
+        <w:jc w:val="left"/>
+      </w:pPr>
+      <w:r>
+        <w:rPr>
+          <w:i/>
+        </w:rPr>
+        <w:t xml:space="preserve">Defectos encontrados en la prueba de campo</w:t>
+      </w:r>
+    </w:p>
+    <w:tbl>
+      <w:tblPr>
+        <w:tblStyle w:val="TableGrid"/>
+        <w:tblW w:w="7881" w:type="dxa"/>
+        <w:tblInd w:w="958" w:type="dxa"/>
+        <w:tblLayout w:type="fixed"/>
+        <w:tblLook w:val="04A0" w:firstRow="1" w:lastRow="0" w:firstColumn="1" w:lastColumn="0" w:noHBand="0" w:noVBand="1"/>
+      </w:tblPr>
+      <w:tblGrid>
+        <w:gridCol w:w="1758"/>
+        <w:gridCol w:w="3637"/>
+        <w:gridCol w:w="2486"/>
+      </w:tblGrid>
+      <w:tr>
+        <w:trPr>
+          <w:cantSplit/>
+          <w:tblHeader/>
+        </w:trPr>
+        <w:tc>
+          <w:tcPr>
+            <w:tcW w:w="1758" w:type="dxa"/>
+          </w:tcPr>
+          <w:p>
+            <w:pPr>
+              <w:keepNext/>
+              <w:spacing w:before="40" w:after="40" w:line="240" w:lineRule="auto"/>
+              <w:ind w:left="0" w:firstLine="0"/>
+              <w:jc w:val="left"/>
+            </w:pPr>
+            <w:r>
+              <w:rPr>
+                <w:b/>
+                <w:sz w:val="20"/>
+                <w:szCs w:val="20"/>
+              </w:rPr>
+              <w:t xml:space="preserve">Defecto</w:t>
+            </w:r>
+          </w:p>
+        </w:tc>
+        <w:tc>
+          <w:tcPr>
+            <w:tcW w:w="3637" w:type="dxa"/>
+          </w:tcPr>
+          <w:p>
+            <w:pPr>
+              <w:keepNext/>
+              <w:spacing w:before="40" w:after="40" w:line="240" w:lineRule="auto"/>
+              <w:ind w:left="0" w:firstLine="0"/>
+              <w:jc w:val="left"/>
+            </w:pPr>
+            <w:r>
+              <w:rPr>
+                <w:b/>
+                <w:sz w:val="20"/>
+                <w:szCs w:val="20"/>
+              </w:rPr>
+              <w:t xml:space="preserve">Lo que se observó</w:t>
+            </w:r>
+          </w:p>
+        </w:tc>
+        <w:tc>
+          <w:tcPr>
+            <w:tcW w:w="2486" w:type="dxa"/>
+          </w:tcPr>
+          <w:p>
+            <w:pPr>
+              <w:keepNext/>
+              <w:spacing w:before="40" w:after="40" w:line="240" w:lineRule="auto"/>
+              <w:ind w:left="0" w:firstLine="0"/>
+              <w:jc w:val="left"/>
+            </w:pPr>
+            <w:r>
+              <w:rPr>
+                <w:b/>
+                <w:sz w:val="20"/>
+                <w:szCs w:val="20"/>
+              </w:rPr>
+              <w:t xml:space="preserve">Consecuencia para el planificador</w:t>
+            </w:r>
+          </w:p>
+        </w:tc>
+      </w:tr>
+      <w:tr>
+        <w:trPr>
+          <w:cantSplit/>
+        </w:trPr>
+        <w:tc>
+          <w:tcPr>
+            <w:tcW w:w="1758" w:type="dxa"/>
+          </w:tcPr>
+          <w:p>
+            <w:pPr>
+              <w:spacing w:before="40" w:after="40" w:line="240" w:lineRule="auto"/>
+              <w:ind w:left="0" w:firstLine="0"/>
+              <w:jc w:val="left"/>
+            </w:pPr>
+            <w:r>
+              <w:rPr>
+                <w:b/>
+                <w:sz w:val="20"/>
+                <w:szCs w:val="20"/>
+              </w:rPr>
+              <w:t xml:space="preserve">Pesos declarados solo como VGM</w:t>
+            </w:r>
+          </w:p>
+        </w:tc>
+        <w:tc>
+          <w:tcPr>
+            <w:tcW w:w="3637" w:type="dxa"/>
+          </w:tcPr>
+          <w:p>
+            <w:pPr>
+              <w:spacing w:before="40" w:after="40" w:line="240" w:lineRule="auto"/>
+              <w:ind w:left="0" w:firstLine="0"/>
+              <w:jc w:val="left"/>
+            </w:pPr>
+            <w:r>
+              <w:rPr>
+                <w:sz w:val="20"/>
+                <w:szCs w:val="20"/>
+              </w:rPr>
+              <w:t xml:space="preserve">En el plano de llegada, 333 de 398 contenedores traían el peso solo como masa bruta verificada (VGM). La aplicación los mostraba sin peso y los totales por bahía en cero.</w:t>
+            </w:r>
+          </w:p>
+        </w:tc>
+        <w:tc>
+          <w:tcPr>
+            <w:tcW w:w="2486" w:type="dxa"/>
+          </w:tcPr>
+          <w:p>
+            <w:pPr>
+              <w:spacing w:before="40" w:after="40" w:line="240" w:lineRule="auto"/>
+              <w:ind w:left="0" w:firstLine="0"/>
+              <w:jc w:val="left"/>
+            </w:pPr>
+            <w:r>
+              <w:rPr>
+                <w:sz w:val="20"/>
+                <w:szCs w:val="20"/>
+              </w:rPr>
+              <w:t xml:space="preserve">No ve el peso del contenedor ni el de la bahía.</w:t>
+            </w:r>
+          </w:p>
+        </w:tc>
+      </w:tr>
+      <w:tr>
+        <w:trPr>
+          <w:cantSplit/>
+        </w:trPr>
+        <w:tc>
+          <w:tcPr>
+            <w:tcW w:w="1758" w:type="dxa"/>
+          </w:tcPr>
+          <w:p>
+            <w:pPr>
+              <w:spacing w:before="40" w:after="40" w:line="240" w:lineRule="auto"/>
+              <w:ind w:left="0" w:firstLine="0"/>
+              <w:jc w:val="left"/>
+            </w:pPr>
+            <w:r>
+              <w:rPr>
+                <w:b/>
+                <w:sz w:val="20"/>
+                <w:szCs w:val="20"/>
+              </w:rPr>
+              <w:t xml:space="preserve">Peso por pila</w:t>
+            </w:r>
+          </w:p>
+        </w:tc>
+        <w:tc>
+          <w:tcPr>
+            <w:tcW w:w="3637" w:type="dxa"/>
+          </w:tcPr>
+          <w:p>
+            <w:pPr>
+              <w:spacing w:before="40" w:after="40" w:line="240" w:lineRule="auto"/>
+              <w:ind w:left="0" w:firstLine="0"/>
+              <w:jc w:val="left"/>
+            </w:pPr>
+            <w:r>
+              <w:rPr>
+                <w:sz w:val="20"/>
+                <w:szCs w:val="20"/>
+              </w:rPr>
+              <w:t xml:space="preserve">Un contenedor sin peso bruto cuenta como cero, y la regla puede no alertar aunque la pila esté excedida.</w:t>
+            </w:r>
+          </w:p>
+        </w:tc>
+        <w:tc>
+          <w:tcPr>
+            <w:tcW w:w="2486" w:type="dxa"/>
+          </w:tcPr>
+          <w:p>
+            <w:pPr>
+              <w:spacing w:before="40" w:after="40" w:line="240" w:lineRule="auto"/>
+              <w:ind w:left="0" w:firstLine="0"/>
+              <w:jc w:val="left"/>
+            </w:pPr>
+            <w:r>
+              <w:rPr>
+                <w:sz w:val="20"/>
+                <w:szCs w:val="20"/>
+              </w:rPr>
+              <w:t xml:space="preserve">La regla calla en lugar de declararse no evaluada, contra el diseño de tres estados.</w:t>
+            </w:r>
+          </w:p>
+        </w:tc>
+      </w:tr>
+      <w:tr>
+        <w:trPr>
+          <w:cantSplit/>
+        </w:trPr>
+        <w:tc>
+          <w:tcPr>
+            <w:tcW w:w="1758" w:type="dxa"/>
+          </w:tcPr>
+          <w:p>
+            <w:pPr>
+              <w:spacing w:before="40" w:after="40" w:line="240" w:lineRule="auto"/>
+              <w:ind w:left="0" w:firstLine="0"/>
+              <w:jc w:val="left"/>
+            </w:pPr>
+            <w:r>
+              <w:rPr>
+                <w:b/>
+                <w:sz w:val="20"/>
+                <w:szCs w:val="20"/>
+              </w:rPr>
+              <w:t xml:space="preserve">Puerto de escala en planos de llegada</w:t>
+            </w:r>
+          </w:p>
+        </w:tc>
+        <w:tc>
+          <w:tcPr>
+            <w:tcW w:w="3637" w:type="dxa"/>
+          </w:tcPr>
+          <w:p>
+            <w:pPr>
+              <w:spacing w:before="40" w:after="40" w:line="240" w:lineRule="auto"/>
+              <w:ind w:left="0" w:firstLine="0"/>
+              <w:jc w:val="left"/>
+            </w:pPr>
+            <w:r>
+              <w:rPr>
+                <w:sz w:val="20"/>
+                <w:szCs w:val="20"/>
+              </w:rPr>
+              <w:t xml:space="preserve">La escala se proponía desde el puerto de salida del mensaje y no desde el siguiente puerto: los 114 contenedores a descargar aparecían como de paso.</w:t>
+            </w:r>
+          </w:p>
+        </w:tc>
+        <w:tc>
+          <w:tcPr>
+            <w:tcW w:w="2486" w:type="dxa"/>
+          </w:tcPr>
+          <w:p>
+            <w:pPr>
+              <w:spacing w:before="40" w:after="40" w:line="240" w:lineRule="auto"/>
+              <w:ind w:left="0" w:firstLine="0"/>
+              <w:jc w:val="left"/>
+            </w:pPr>
+            <w:r>
+              <w:rPr>
+                <w:sz w:val="20"/>
+                <w:szCs w:val="20"/>
+              </w:rPr>
+              <w:t xml:space="preserve">La distinción entre lo que baja y lo que sigue a bordo sale invertida.</w:t>
+            </w:r>
+          </w:p>
+        </w:tc>
+      </w:tr>
+      <w:tr>
+        <w:trPr>
+          <w:cantSplit/>
+        </w:trPr>
+        <w:tc>
+          <w:tcPr>
+            <w:tcW w:w="1758" w:type="dxa"/>
+          </w:tcPr>
+          <w:p>
+            <w:pPr>
+              <w:keepNext/>
+              <w:spacing w:before="40" w:after="40" w:line="240" w:lineRule="auto"/>
+              <w:ind w:left="0" w:firstLine="0"/>
+              <w:jc w:val="left"/>
+            </w:pPr>
+            <w:r>
+              <w:rPr>
+                <w:b/>
+                <w:sz w:val="20"/>
+                <w:szCs w:val="20"/>
+              </w:rPr>
+              <w:t xml:space="preserve">Celdas reservadas sin número de contenedor</w:t>
+            </w:r>
+          </w:p>
+        </w:tc>
+        <w:tc>
+          <w:tcPr>
+            <w:tcW w:w="3637" w:type="dxa"/>
+          </w:tcPr>
+          <w:p>
+            <w:pPr>
+              <w:keepNext/>
+              <w:spacing w:before="40" w:after="40" w:line="240" w:lineRule="auto"/>
+              <w:ind w:left="0" w:firstLine="0"/>
+              <w:jc w:val="left"/>
+            </w:pPr>
+            <w:r>
+              <w:rPr>
+                <w:sz w:val="20"/>
+                <w:szCs w:val="20"/>
+              </w:rPr>
+              <w:t xml:space="preserve">El plan de carga reserva 55 celdas para vacíos que aún no tienen número asignado. El lector las descarta sin aviso y la aplicación muestra 405 de 460 posiciones.</w:t>
+            </w:r>
+          </w:p>
+        </w:tc>
+        <w:tc>
+          <w:tcPr>
+            <w:tcW w:w="2486" w:type="dxa"/>
+          </w:tcPr>
+          <w:p>
+            <w:pPr>
+              <w:keepNext/>
+              <w:spacing w:before="40" w:after="40" w:line="240" w:lineRule="auto"/>
+              <w:ind w:left="0" w:firstLine="0"/>
+              <w:jc w:val="left"/>
+            </w:pPr>
+            <w:r>
+              <w:rPr>
+                <w:sz w:val="20"/>
+                <w:szCs w:val="20"/>
+              </w:rPr>
+              <w:t xml:space="preserve">Desaparecen del plano las posiciones que el muelle debe llenar.</w:t>
+            </w:r>
+          </w:p>
+        </w:tc>
+      </w:tr>
+    </w:tbl>
+    <w:p>
+      <w:pPr>
+        <w:spacing w:before="80" w:after="880"/>
+        <w:ind w:left="850" w:firstLine="0"/>
+        <w:jc w:val="left"/>
+      </w:pPr>
+      <w:r>
+        <w:rPr>
+          <w:b/>
+        </w:rPr>
+        <w:t xml:space="preserve">Fuente: </w:t>
+      </w:r>
+      <w:r>
+        <w:t xml:space="preserve">Elaboración propia, con base en el registro de decisiones del Sprint 2.</w:t>
+      </w:r>
+    </w:p>
+    <w:p>
+      <w:pPr>
+        <w:spacing w:after="880"/>
+        <w:ind w:left="850" w:firstLine="357"/>
+        <w:jc w:val="both"/>
+      </w:pPr>
+      <w:r>
+        <w:t xml:space="preserve">Tres de los cuatro defectos se podían reproducir con el corpus. CORPUS_A05 trae todos sus pesos solo como VGM, lo que basta para los dos primeros, y CORPUS_A02 es un plano de llegada con la misma estructura que el de la prueba. Ninguna verificación del sprint los detectó, porque los criterios de aceptación se centraban en las reglas de estiba y no en los datos que el planificador lee en pantalla. El cuarto sí era nuevo: ningún archivo del corpus reserva celdas sin número de contenedor.</w:t>
+      </w:r>
+    </w:p>
+    <w:p>
+      <w:pPr>
+        <w:spacing w:after="880"/>
+        <w:ind w:left="850" w:firstLine="357"/>
+        <w:jc w:val="both"/>
+      </w:pPr>
+      <w:r>
+        <w:t xml:space="preserve">La prueba también documentó, con la escala completa, cómo se registra hoy la operación en el muelle. El listado de exportación, el plan del planificador y el plano impreso que el tarjador anotó a mano coinciden en los 176 movimientos de carga. Son 120 llenos con la posición que fijó el planificador de la línea y 56 vacíos que llegan como celdas reservadas por tipo, puerto de descarga y línea; el tarjador asignó cada vacío a una celda de su grupo, y el registro en papel incluye un intercambio de posición entre dos llenos y una corrección. Ese es el procedimiento que debe reemplazar el módulo de muelle que exige H3 (apartado IV.D), y la escala observada se convierte en su prueba de aceptación.</w:t>
       </w:r>
     </w:p>
     <w:p>
@@ -10186,7 +10525,7 @@
         <w:t xml:space="preserve">La doble prueba.</w:t>
       </w:r>
       <w:r>
-        <w:t xml:space="preserve"> La Tabla 89 reúne nueve casos seleccionados en que una segunda revisión encontró algo que la primera había dado por bueno; el registro del sprint contiene otros.</w:t>
+        <w:t xml:space="preserve"> La Tabla 90 reúne nueve casos seleccionados en que una segunda revisión encontró algo que la primera había dado por bueno; el registro del sprint contiene otros.</w:t>
       </w:r>
     </w:p>
     <w:p>
@@ -10200,7 +10539,7 @@
         <w:rPr>
           <w:b/>
         </w:rPr>
-        <w:t>Tabla 89.</w:t>
+        <w:t>Tabla 90.</w:t>
       </w:r>
     </w:p>
     <w:p>
@@ -11157,6 +11496,26 @@
       </w:r>
       <w:r>
         <w:t xml:space="preserve"> Depende de recursos que descarga de servidores de Google al iniciar.</w:t>
+      </w:r>
+    </w:p>
+    <w:p>
+      <w:pPr>
+        <w:numPr>
+          <w:ilvl w:val="0"/>
+          <w:numId w:val="50"/>
+        </w:numPr>
+        <w:spacing w:after="880"/>
+        <w:ind w:left="1559" w:hanging="709"/>
+        <w:jc w:val="both"/>
+      </w:pPr>
+      <w:r>
+        <w:rPr>
+          <w:b/>
+        </w:rPr>
+        <w:t xml:space="preserve">La aceptación no revisó lo que el planificador lee en pantalla.</w:t>
+      </w:r>
+      <w:r>
+        <w:t xml:space="preserve"> Tres de los defectos de la prueba de campo se podían reproducir con el corpus, pero los criterios se centraban en las reglas de estiba. Los encontró el primer uso con una operación real.</w:t>
       </w:r>
     </w:p>
     <w:p>
@@ -11289,6 +11648,20 @@
     </w:p>
     <w:p>
       <w:pPr>
+        <w:numPr>
+          <w:ilvl w:val="0"/>
+          <w:numId w:val="50"/>
+        </w:numPr>
+        <w:spacing w:after="880"/>
+        <w:ind w:left="1559" w:hanging="709"/>
+        <w:jc w:val="both"/>
+      </w:pPr>
+      <w:r>
+        <w:t xml:space="preserve">Probar cada incremento con los archivos de una operación real, además del corpus, y usar la escala observada como prueba de aceptación del módulo de muelle.</w:t>
+      </w:r>
+    </w:p>
+    <w:p>
+      <w:pPr>
         <w:pStyle w:val="Heading2"/>
         <w:spacing w:before="0" w:after="760"/>
       </w:pPr>
@@ -11389,7 +11762,7 @@
         <w:jc w:val="both"/>
       </w:pPr>
       <w:r>
-        <w:t xml:space="preserve">El Sprint 2 cumplió su objetivo. La aplicación dejó de inferir el buque y pasó a conocerlo: la geometría se declara una vez, se recuerda entre escalas y sostiene un motor de validación de cuatro reglas con tres estados. De las 26 tareas comprometidas se terminaron 25, con 33.0 de las 35.0 horas; la restante ya está publicada en la prueba interna de Google Play, y solo falta comprobar su instalación desde la tienda.</w:t>
+        <w:t xml:space="preserve">El Sprint 2 cumplió su objetivo. La aplicación dejó de inferir el buque y pasó a conocerlo: la geometría se declara una vez, se recuerda entre escalas y sostiene un motor de validación de cuatro reglas con tres estados. Las 26 tareas comprometidas se terminaron, con sus 35.0 horas, y la última dejó la aplicación instalada en el teléfono desde la prueba interna de Google Play.</w:t>
       </w:r>
     </w:p>
     <w:p>
@@ -11420,6 +11793,16 @@
       </w:pPr>
       <w:r>
         <w:t xml:space="preserve">En seguridad, los siete hallazgos de la línea base quedan con tratamiento y evidencia: cuatro resueltos o cerrados (H‑01, H‑03, H‑04 y H‑07), uno atendido en el caso medido (H‑05), uno reacotado con su riesgo residual declarado (H‑02) y uno con una limitación declarada y un control manual que la reemplaza (H‑06). La observación del tráfico, hecha con controles positivos, no registró ninguna transmisión de datos del usuario en las operaciones probadas.</w:t>
+      </w:r>
+    </w:p>
+    <w:p>
+      <w:pPr>
+        <w:spacing w:after="880"/>
+        <w:ind w:left="425" w:firstLine="357"/>
+        <w:jc w:val="both"/>
+      </w:pPr>
+      <w:r>
+        <w:t xml:space="preserve">La primera prueba de campo con una operación real encontró cuatro defectos, tres de ellos al alcance del corpus sin que ninguna verificación del sprint los buscara, y confirmó con la escala completa el procedimiento de muelle que el producto debe reemplazar. Los cuatro abren el sprint siguiente.</w:t>
       </w:r>
     </w:p>
     <w:p>

</xml_diff>